<commit_message>
Resume: list Java, used with Selenium and TestNG at Ace Infoway; rebuild artifacts
Co-Authored-By: Claude Fable 5.1 <noreply@anthropic.com>
</commit_message>
<xml_diff>
--- a/public/Dev-Shah-Senior-QA-Engineer-SDET.docx
+++ b/public/Dev-Shah-Senior-QA-Engineer-SDET.docx
@@ -95,7 +95,7 @@
         <w:rPr>
           <w:sz w:val="22"/>
         </w:rPr>
-        <w:t>Playwright, Selenium WebDriver, Appium, TestNG, Cucumber (BDD), Page Object Model, REST API automation, Postman, TestRigor, Vitest, JavaScript / TypeScript, Python</w:t>
+        <w:t>Playwright, Selenium WebDriver, Appium, TestNG, Cucumber (BDD), Page Object Model, REST API automation, Postman, TestRigor, Vitest, JavaScript / TypeScript, Java, Python</w:t>
       </w:r>
     </w:p>
     <w:p>
@@ -314,7 +314,7 @@
         <w:rPr>
           <w:sz w:val="22"/>
         </w:rPr>
-        <w:t>Built and maintained Selenium and Playwright frameworks on the Page Object Model with Cucumber BDD, covering web, Android and iOS from a single unified codebase.</w:t>
+        <w:t>Built and maintained Selenium (Java, TestNG) and Playwright frameworks on the Page Object Model with Cucumber BDD, covering web, Android and iOS from a single unified codebase.</w:t>
       </w:r>
     </w:p>
     <w:p>
@@ -677,7 +677,7 @@
           <w:color w:val="45443D"/>
           <w:sz w:val="20"/>
         </w:rPr>
-        <w:t>Ace Infoway  |  Selenium, Playwright, Appium, Cucumber BDD, TestNG, Maven, SQL</w:t>
+        <w:t>Ace Infoway  |  Selenium, Java, Playwright, Appium, Cucumber BDD, TestNG, Maven, SQL</w:t>
       </w:r>
     </w:p>
     <w:p>

</xml_diff>

<commit_message>
Resume: add confirmed tooling to skills; keep the PDF at two pages
Cypress, WebdriverIO, Robot Framework, JUnit, pytest, Mocha, REST Assured,
SoapUI, Swagger, contract testing, microservices, C#, Spring Boot, Django,
JMeter, k6, Burp Suite, ETL testing, MongoDB, Jenkins, GitLab CI, AWS,
Google Cloud, Linux, BrowserStack, Bitbucket, observability tooling and
mentoring, confirmed 2026-09-22. Margin 0.6in and line height 1.08 so the
PDF stays on two pages. Rebuilt PDF, DOCX and TXT.

Co-Authored-By: Claude Fable 5.1 <noreply@anthropic.com>
</commit_message>
<xml_diff>
--- a/public/Dev-Shah-Senior-QA-Engineer-SDET.docx
+++ b/public/Dev-Shah-Senior-QA-Engineer-SDET.docx
@@ -95,7 +95,7 @@
         <w:rPr>
           <w:sz w:val="22"/>
         </w:rPr>
-        <w:t>Playwright, Selenium WebDriver, Appium, TestNG, Cucumber (BDD), Page Object Model, REST API automation, Postman, TestRigor, Vitest, JavaScript / TypeScript, Java, Python</w:t>
+        <w:t>Playwright, Selenium WebDriver, Appium, TestNG, Cucumber (BDD), Page Object Model, REST API automation, Postman, TestRigor, Vitest, JavaScript / TypeScript, Java, Python, Cypress, WebdriverIO, Robot Framework, JUnit, pytest, Mocha / Chai, REST Assured, SoapUI, Swagger / OpenAPI, contract testing (Pact), microservices, C# / .NET, Spring Boot, Django / Flask</w:t>
       </w:r>
     </w:p>
     <w:p>
@@ -114,7 +114,7 @@
         <w:rPr>
           <w:sz w:val="22"/>
         </w:rPr>
-        <w:t>Test planning and strategy, end-to-end testing (web, mobile and desktop), manual and regression testing, functional and UI testing, exploratory and edge-case testing, UAT coordination and sign-off, release readiness reporting, defect management, database validation (SQL / MS SQL), security spot-checks</w:t>
+        <w:t>Test planning and strategy, end-to-end testing (web, mobile and desktop), manual and regression testing, functional and UI testing, exploratory and edge-case testing, UAT coordination and sign-off, release readiness reporting, defect management, database validation (SQL / MS SQL, MongoDB), performance and load testing (JMeter, k6, LoadRunner), security testing (Burp Suite, OWASP ZAP), ETL / data-pipeline testing</w:t>
       </w:r>
     </w:p>
     <w:p>
@@ -152,7 +152,7 @@
         <w:rPr>
           <w:sz w:val="22"/>
         </w:rPr>
-        <w:t>GitHub Actions, CI pipeline maintenance and debugging, automated regression runs, Docker, containerised build pipelines, Android emulator and AVD provisioning, Vercel</w:t>
+        <w:t>GitHub Actions, CI pipeline maintenance and debugging, automated regression runs, Docker, Android emulator and AVD provisioning, Jenkins, GitLab CI, Bitbucket, AWS, Google Cloud, Vercel, Linux, BrowserStack / LambdaTest, Grafana / Datadog / Splunk</w:t>
       </w:r>
     </w:p>
     <w:p>
@@ -171,7 +171,7 @@
         <w:rPr>
           <w:sz w:val="22"/>
         </w:rPr>
-        <w:t>Git, GitHub, GitLab, Jira, Agile / Scrum (SDLC / STLC), Maven, Zoho</w:t>
+        <w:t>Git, GitHub, GitLab, Jira, Agile / Scrum (SDLC / STLC), Maven, Zoho, mentoring</w:t>
       </w:r>
     </w:p>
     <w:p>

</xml_diff>

<commit_message>
Resume: career start Aug 2023, Codesage deployed at EnAble India (NGO); rebuild artifacts
Co-Authored-By: Claude Opus 5.5 <noreply@anthropic.com>
</commit_message>
<xml_diff>
--- a/public/Dev-Shah-Senior-QA-Engineer-SDET.docx
+++ b/public/Dev-Shah-Senior-QA-Engineer-SDET.docx
@@ -63,7 +63,7 @@
         <w:rPr>
           <w:sz w:val="22"/>
         </w:rPr>
-        <w:t>Senior QA Engineer and SDET with nearly three years owning quality end to end - test strategy, automation across web, Android and desktop, and WCAG 2.1 / 2.2 AA accessibility. Sole quality owner on a live React 19 and Hono / PostgreSQL platform, where I authored a 1,028-case suite, built the team's test-management tooling as a deployed product, and merged 206 commits into the product itself.</w:t>
+        <w:t>Senior QA Engineer and SDET with three years owning quality end to end - test strategy, automation across web, Android and desktop, and WCAG 2.1 / 2.2 AA accessibility. Sole quality owner on a live React 19 and Hono / PostgreSQL platform, where I authored a 1,028-case suite, built the team's test-management tooling as a deployed product, and merged 206 commits into the product itself.</w:t>
       </w:r>
     </w:p>
     <w:p>
@@ -197,7 +197,7 @@
           <w:b/>
           <w:sz w:val="23"/>
         </w:rPr>
-        <w:t>Senior QA Engineer / Full-Stack SDET - Codesage (deployed at EnAble India)</w:t>
+        <w:t>Senior QA Engineer / Full-Stack SDET - Codesage (deployed at EnAble India, an NGO)</w:t>
       </w:r>
     </w:p>
     <w:p>
@@ -301,7 +301,7 @@
           <w:color w:val="45443D"/>
           <w:sz w:val="20"/>
         </w:rPr>
-        <w:t>Ahmedabad, India | Nov 2023 - Jan 2026 | Full-time</w:t>
+        <w:t>Ahmedabad, India | Aug 2023 - Jan 2026 | Full-time</w:t>
       </w:r>
     </w:p>
     <w:p>

</xml_diff>